<commit_message>
Word templates: Century Gothic throughout, tab-stop headers, sharper logos
</commit_message>
<xml_diff>
--- a/brand/bolt-creative-letterhead.docx
+++ b/brand/bolt-creative-letterhead.docx
@@ -36,10 +36,10 @@
     </w:p>
     <w:p>
       <w:pPr>
-        <w:spacing w:after="160" w:line="300"/>
-      </w:pPr>
-      <w:r>
-        <w:t xml:space="preserve">Body copy is Century Gothic at 11pt. It ships with Office, so it is already on every machine here, and it is the same geometric shape as Jost on the website — a document and the site will not look like two different companies.</w:t>
+        <w:pStyle w:val="Body"/>
+      </w:pPr>
+      <w:r>
+        <w:t xml:space="preserve">Body copy is Century Gothic at 10pt. It ships with Office, so it is already on every machine here, and it is the same geometric shape as Jost on the website — a document and the site will not look like two different companies.</w:t>
       </w:r>
     </w:p>
     <w:p>
@@ -52,7 +52,7 @@
     </w:p>
     <w:p>
       <w:pPr>
-        <w:spacing w:after="160" w:line="300"/>
+        <w:pStyle w:val="Body"/>
       </w:pPr>
       <w:r>
         <w:t xml:space="preserve">Use heading one for the main sections and heading two beneath it. They are already in the Styles gallery, so pick them from there rather than bolding text by hand — that way the table of contents works and the document stays consistent.</w:t>
@@ -60,9 +60,17 @@
     </w:p>
     <w:p>
       <w:pPr>
-        <w:pStyle w:val="Pullquote"/>
-      </w:pPr>
-      <w:r>
+        <w:pStyle w:val="Body"/>
+        <w:pBdr>
+          <w:left w:val="single" w:color="C6FF3D" w:sz="18" w:space="14"/>
+        </w:pBdr>
+        <w:ind w:left="360"/>
+      </w:pPr>
+      <w:r>
+        <w:rPr>
+          <w:i/>
+          <w:iCs/>
+        </w:rPr>
         <w:t xml:space="preserve">Pull out a line that matters with the Pullquote style. It carries the brand rule on the left.</w:t>
       </w:r>
     </w:p>
@@ -76,7 +84,7 @@
     </w:p>
     <w:p>
       <w:pPr>
-        <w:spacing w:after="160" w:line="300"/>
+        <w:pStyle w:val="Body"/>
       </w:pPr>
       <w:r>
         <w:t xml:space="preserve">Check that the brand name is written in full — Bolt Creative — and that the Inc. 5000 badge in the header has not been resized out of proportion or recolored.</w:t>
@@ -86,7 +94,7 @@
       <w:headerReference w:type="default" r:id="rId7"/>
       <w:footerReference w:type="default" r:id="rId8"/>
       <w:pgSz w:w="12240" w:h="15840" w:orient="portrait"/>
-      <w:pgMar w:top="2500" w:right="1080" w:bottom="2000" w:left="1080" w:header="700" w:footer="520" w:gutter="0"/>
+      <w:pgMar w:top="2350" w:right="1080" w:bottom="1700" w:left="1080" w:header="680" w:footer="420" w:gutter="0"/>
       <w:pgNumType/>
       <w:docGrid w:linePitch="360"/>
     </w:sectPr>
@@ -139,7 +147,7 @@
 <w:ftr xmlns:wpc="http://schemas.microsoft.com/office/word/2010/wordprocessingCanvas" xmlns:mc="http://schemas.openxmlformats.org/markup-compatibility/2006" xmlns:o="urn:schemas-microsoft-com:office:office" xmlns:r="http://schemas.openxmlformats.org/officeDocument/2006/relationships" xmlns:m="http://schemas.openxmlformats.org/officeDocument/2006/math" xmlns:v="urn:schemas-microsoft-com:vml" xmlns:wp14="http://schemas.microsoft.com/office/word/2010/wordprocessingDrawing" xmlns:wp="http://schemas.openxmlformats.org/drawingml/2006/wordprocessingDrawing" xmlns:w10="urn:schemas-microsoft-com:office:word" xmlns:w="http://schemas.openxmlformats.org/wordprocessingml/2006/main" xmlns:w14="http://schemas.microsoft.com/office/word/2010/wordml" xmlns:w15="http://schemas.microsoft.com/office/word/2012/wordml" xmlns:wpg="http://schemas.microsoft.com/office/word/2010/wordprocessingGroup" xmlns:wpi="http://schemas.microsoft.com/office/word/2010/wordprocessingInk" xmlns:wne="http://schemas.microsoft.com/office/word/2006/wordml" xmlns:wps="http://schemas.microsoft.com/office/word/2010/wordprocessingShape">
   <w:p>
     <w:pPr>
-      <w:spacing w:after="60"/>
+      <w:spacing w:after="70"/>
       <w:jc w:val="center"/>
     </w:pPr>
     <w:r>
@@ -155,13 +163,12 @@
   <w:p>
     <w:pPr>
       <w:spacing w:after="0"/>
-      <w:ind w:left="-1080" w:right="-1080"/>
       <w:jc w:val="center"/>
     </w:pPr>
     <w:r>
       <w:drawing>
         <wp:inline distT="0" distB="0" distL="0" distR="0">
-          <wp:extent cx="7772400" cy="571500"/>
+          <wp:extent cx="4457700" cy="323850"/>
           <wp:effectExtent t="0" r="0" b="0" l="0"/>
           <wp:docPr id="1" name="" descr="" title=""/>
           <wp:cNvGraphicFramePr>
@@ -186,7 +193,7 @@
                 <pic:spPr bwMode="auto">
                   <a:xfrm>
                     <a:off x="0" y="0"/>
-                    <a:ext cx="7772400" cy="571500"/>
+                    <a:ext cx="4457700" cy="323850"/>
                   </a:xfrm>
                   <a:prstGeom prst="rect">
                     <a:avLst/>
@@ -241,189 +248,131 @@
 
 <file path=word/header1.xml><?xml version="1.0" encoding="utf-8"?>
 <w:hdr xmlns:wpc="http://schemas.microsoft.com/office/word/2010/wordprocessingCanvas" xmlns:mc="http://schemas.openxmlformats.org/markup-compatibility/2006" xmlns:o="urn:schemas-microsoft-com:office:office" xmlns:r="http://schemas.openxmlformats.org/officeDocument/2006/relationships" xmlns:m="http://schemas.openxmlformats.org/officeDocument/2006/math" xmlns:v="urn:schemas-microsoft-com:vml" xmlns:wp14="http://schemas.microsoft.com/office/word/2010/wordprocessingDrawing" xmlns:wp="http://schemas.openxmlformats.org/drawingml/2006/wordprocessingDrawing" xmlns:w10="urn:schemas-microsoft-com:office:word" xmlns:w="http://schemas.openxmlformats.org/wordprocessingml/2006/main" xmlns:w14="http://schemas.microsoft.com/office/word/2010/wordml" xmlns:w15="http://schemas.microsoft.com/office/word/2012/wordml" xmlns:wpg="http://schemas.microsoft.com/office/word/2010/wordprocessingGroup" xmlns:wpi="http://schemas.microsoft.com/office/word/2010/wordprocessingInk" xmlns:wne="http://schemas.microsoft.com/office/word/2006/wordml" xmlns:wps="http://schemas.microsoft.com/office/word/2010/wordprocessingShape" xmlns:cx="http://schemas.microsoft.com/office/drawing/2014/chartex" xmlns:cx1="http://schemas.microsoft.com/office/drawing/2015/9/8/chartex" xmlns:cx2="http://schemas.microsoft.com/office/drawing/2015/10/21/chartex" xmlns:cx3="http://schemas.microsoft.com/office/drawing/2016/5/9/chartex" xmlns:cx4="http://schemas.microsoft.com/office/drawing/2016/5/10/chartex" xmlns:cx5="http://schemas.microsoft.com/office/drawing/2016/5/11/chartex" xmlns:cx6="http://schemas.microsoft.com/office/drawing/2016/5/12/chartex" xmlns:cx7="http://schemas.microsoft.com/office/drawing/2016/5/13/chartex" xmlns:cx8="http://schemas.microsoft.com/office/drawing/2016/5/14/chartex" xmlns:w16cid="http://schemas.microsoft.com/office/word/2016/wordml/cid" xmlns:w16se="http://schemas.microsoft.com/office/word/2015/wordml/symex">
-  <w:tbl>
-    <w:tblPr>
-      <w:tblW w:type="dxa" w:w="10360"/>
-      <w:tblBorders>
-        <w:top w:val="none" w:color="FFFFFF" w:sz="0"/>
-        <w:left w:val="none" w:color="FFFFFF" w:sz="0"/>
-        <w:bottom w:val="none" w:color="FFFFFF" w:sz="0"/>
-        <w:right w:val="none" w:color="FFFFFF" w:sz="0"/>
-        <w:insideH w:val="none" w:color="FFFFFF" w:sz="0"/>
-        <w:insideV w:val="none" w:color="FFFFFF" w:sz="0"/>
-      </w:tblBorders>
-    </w:tblPr>
-    <w:tblGrid>
-      <w:gridCol w:w="3700"/>
-      <w:gridCol w:w="1200"/>
-      <w:gridCol w:w="5460"/>
-    </w:tblGrid>
-    <w:tr>
-      <w:tc>
-        <w:tcPr>
-          <w:tcW w:type="dxa" w:w="3700"/>
-          <w:tcBorders>
-            <w:top w:val="none" w:color="FFFFFF" w:sz="0"/>
-            <w:left w:val="none" w:color="FFFFFF" w:sz="0"/>
-            <w:bottom w:val="none" w:color="FFFFFF" w:sz="0"/>
-            <w:right w:val="none" w:color="FFFFFF" w:sz="0"/>
-          </w:tcBorders>
-          <w:tcMar>
-            <w:top w:type="dxa" w:w="0"/>
-            <w:left w:type="dxa" w:w="0"/>
-            <w:bottom w:type="dxa" w:w="0"/>
-            <w:right w:type="dxa" w:w="0"/>
-          </w:tcMar>
-          <w:vAlign w:val="center"/>
-        </w:tcPr>
-        <w:p>
-          <w:r>
-            <w:drawing>
-              <wp:inline distT="0" distB="0" distL="0" distR="0">
-                <wp:extent cx="514350" cy="561975"/>
-                <wp:effectExtent t="0" r="0" b="0" l="0"/>
-                <wp:docPr id="1" name="" descr="" title=""/>
-                <wp:cNvGraphicFramePr>
-                  <a:graphicFrameLocks xmlns:a="http://schemas.openxmlformats.org/drawingml/2006/main" noChangeAspect="1"/>
-                </wp:cNvGraphicFramePr>
-                <a:graphic xmlns:a="http://schemas.openxmlformats.org/drawingml/2006/main">
-                  <a:graphicData uri="http://schemas.openxmlformats.org/drawingml/2006/picture">
-                    <pic:pic xmlns:pic="http://schemas.openxmlformats.org/drawingml/2006/picture">
-                      <pic:nvPicPr>
-                        <pic:cNvPr id="0" name="" descr=""/>
-                        <pic:cNvPicPr>
-                          <a:picLocks noChangeAspect="1" noChangeArrowheads="1"/>
-                        </pic:cNvPicPr>
-                      </pic:nvPicPr>
-                      <pic:blipFill>
-                        <a:blip r:embed="rId0" cstate="none"/>
-                        <a:srcRect/>
-                        <a:stretch>
-                          <a:fillRect/>
-                        </a:stretch>
-                      </pic:blipFill>
-                      <pic:spPr bwMode="auto">
-                        <a:xfrm>
-                          <a:off x="0" y="0"/>
-                          <a:ext cx="514350" cy="561975"/>
-                        </a:xfrm>
-                        <a:prstGeom prst="rect">
-                          <a:avLst/>
-                        </a:prstGeom>
-                      </pic:spPr>
-                    </pic:pic>
-                  </a:graphicData>
-                </a:graphic>
-              </wp:inline>
-            </w:drawing>
-          </w:r>
-        </w:p>
-      </w:tc>
-      <w:tc>
-        <w:tcPr>
-          <w:tcW w:type="dxa" w:w="1200"/>
-          <w:tcBorders>
-            <w:top w:val="none" w:color="FFFFFF" w:sz="0"/>
-            <w:left w:val="none" w:color="FFFFFF" w:sz="0"/>
-            <w:bottom w:val="none" w:color="FFFFFF" w:sz="0"/>
-            <w:right w:val="none" w:color="FFFFFF" w:sz="0"/>
-          </w:tcBorders>
-          <w:vAlign w:val="center"/>
-        </w:tcPr>
-        <w:p>
-          <w:pPr>
-            <w:jc w:val="center"/>
-          </w:pPr>
-          <w:r>
-            <w:drawing>
-              <wp:inline distT="0" distB="0" distL="0" distR="0">
-                <wp:extent cx="552450" cy="485775"/>
-                <wp:effectExtent t="0" r="0" b="0" l="0"/>
-                <wp:docPr id="1" name="" descr="" title=""/>
-                <wp:cNvGraphicFramePr>
-                  <a:graphicFrameLocks xmlns:a="http://schemas.openxmlformats.org/drawingml/2006/main" noChangeAspect="1"/>
-                </wp:cNvGraphicFramePr>
-                <a:graphic xmlns:a="http://schemas.openxmlformats.org/drawingml/2006/main">
-                  <a:graphicData uri="http://schemas.openxmlformats.org/drawingml/2006/picture">
-                    <pic:pic xmlns:pic="http://schemas.openxmlformats.org/drawingml/2006/picture">
-                      <pic:nvPicPr>
-                        <pic:cNvPr id="0" name="" descr=""/>
-                        <pic:cNvPicPr>
-                          <a:picLocks noChangeAspect="1" noChangeArrowheads="1"/>
-                        </pic:cNvPicPr>
-                      </pic:nvPicPr>
-                      <pic:blipFill>
-                        <a:blip r:embed="rId1" cstate="none"/>
-                        <a:srcRect/>
-                        <a:stretch>
-                          <a:fillRect/>
-                        </a:stretch>
-                      </pic:blipFill>
-                      <pic:spPr bwMode="auto">
-                        <a:xfrm>
-                          <a:off x="0" y="0"/>
-                          <a:ext cx="552450" cy="485775"/>
-                        </a:xfrm>
-                        <a:prstGeom prst="rect">
-                          <a:avLst/>
-                        </a:prstGeom>
-                      </pic:spPr>
-                    </pic:pic>
-                  </a:graphicData>
-                </a:graphic>
-              </wp:inline>
-            </w:drawing>
-          </w:r>
-        </w:p>
-      </w:tc>
-      <w:tc>
-        <w:tcPr>
-          <w:tcW w:type="dxa" w:w="5460"/>
-          <w:tcBorders>
-            <w:top w:val="none" w:color="FFFFFF" w:sz="0"/>
-            <w:left w:val="none" w:color="FFFFFF" w:sz="0"/>
-            <w:bottom w:val="none" w:color="FFFFFF" w:sz="0"/>
-            <w:right w:val="none" w:color="FFFFFF" w:sz="0"/>
-          </w:tcBorders>
-          <w:vAlign w:val="center"/>
-        </w:tcPr>
-        <w:p>
-          <w:pPr>
-            <w:spacing w:line="230"/>
-          </w:pPr>
-          <w:r>
-            <w:rPr>
-              <w:rFonts w:ascii="Bebas Neue" w:cs="Bebas Neue" w:eastAsia="Bebas Neue" w:hAnsi="Bebas Neue"/>
-              <w:color w:val="16140E"/>
-              <w:sz w:val="21"/>
-              <w:szCs w:val="21"/>
-            </w:rPr>
-            <w:t xml:space="preserve">NAMED TO THE INC. 5000 — AMERICA'S</w:t>
-          </w:r>
-        </w:p>
-        <w:p>
-          <w:pPr>
-            <w:spacing w:line="230"/>
-          </w:pPr>
-          <w:r>
-            <w:rPr>
-              <w:rFonts w:ascii="Bebas Neue" w:cs="Bebas Neue" w:eastAsia="Bebas Neue" w:hAnsi="Bebas Neue"/>
-              <w:color w:val="16140E"/>
-              <w:sz w:val="21"/>
-              <w:szCs w:val="21"/>
-            </w:rPr>
-            <w:t xml:space="preserve">FASTEST-GROWING PRIVATE COMPANIES</w:t>
-          </w:r>
-        </w:p>
-      </w:tc>
-    </w:tr>
-  </w:tbl>
+  <w:p>
+    <w:pPr>
+      <w:tabs>
+        <w:tab w:val="right" w:pos="10080"/>
+      </w:tabs>
+      <w:spacing w:after="0"/>
+    </w:pPr>
+    <w:r>
+      <w:drawing>
+        <wp:inline distT="0" distB="0" distL="0" distR="0">
+          <wp:extent cx="314325" cy="342900"/>
+          <wp:effectExtent t="0" r="0" b="0" l="0"/>
+          <wp:docPr id="1" name="" descr="" title=""/>
+          <wp:cNvGraphicFramePr>
+            <a:graphicFrameLocks xmlns:a="http://schemas.openxmlformats.org/drawingml/2006/main" noChangeAspect="1"/>
+          </wp:cNvGraphicFramePr>
+          <a:graphic xmlns:a="http://schemas.openxmlformats.org/drawingml/2006/main">
+            <a:graphicData uri="http://schemas.openxmlformats.org/drawingml/2006/picture">
+              <pic:pic xmlns:pic="http://schemas.openxmlformats.org/drawingml/2006/picture">
+                <pic:nvPicPr>
+                  <pic:cNvPr id="0" name="" descr=""/>
+                  <pic:cNvPicPr>
+                    <a:picLocks noChangeAspect="1" noChangeArrowheads="1"/>
+                  </pic:cNvPicPr>
+                </pic:nvPicPr>
+                <pic:blipFill>
+                  <a:blip r:embed="rId0" cstate="none"/>
+                  <a:srcRect/>
+                  <a:stretch>
+                    <a:fillRect/>
+                  </a:stretch>
+                </pic:blipFill>
+                <pic:spPr bwMode="auto">
+                  <a:xfrm>
+                    <a:off x="0" y="0"/>
+                    <a:ext cx="314325" cy="342900"/>
+                  </a:xfrm>
+                  <a:prstGeom prst="rect">
+                    <a:avLst/>
+                  </a:prstGeom>
+                </pic:spPr>
+              </pic:pic>
+            </a:graphicData>
+          </a:graphic>
+        </wp:inline>
+      </w:drawing>
+    </w:r>
+    <w:r>
+      <w:tab/>
+    </w:r>
+    <w:r>
+      <w:drawing>
+        <wp:inline distT="0" distB="0" distL="0" distR="0">
+          <wp:extent cx="323850" cy="285750"/>
+          <wp:effectExtent t="0" r="0" b="0" l="0"/>
+          <wp:docPr id="1" name="" descr="" title=""/>
+          <wp:cNvGraphicFramePr>
+            <a:graphicFrameLocks xmlns:a="http://schemas.openxmlformats.org/drawingml/2006/main" noChangeAspect="1"/>
+          </wp:cNvGraphicFramePr>
+          <a:graphic xmlns:a="http://schemas.openxmlformats.org/drawingml/2006/main">
+            <a:graphicData uri="http://schemas.openxmlformats.org/drawingml/2006/picture">
+              <pic:pic xmlns:pic="http://schemas.openxmlformats.org/drawingml/2006/picture">
+                <pic:nvPicPr>
+                  <pic:cNvPr id="0" name="" descr=""/>
+                  <pic:cNvPicPr>
+                    <a:picLocks noChangeAspect="1" noChangeArrowheads="1"/>
+                  </pic:cNvPicPr>
+                </pic:nvPicPr>
+                <pic:blipFill>
+                  <a:blip r:embed="rId1" cstate="none"/>
+                  <a:srcRect/>
+                  <a:stretch>
+                    <a:fillRect/>
+                  </a:stretch>
+                </pic:blipFill>
+                <pic:spPr bwMode="auto">
+                  <a:xfrm>
+                    <a:off x="0" y="0"/>
+                    <a:ext cx="323850" cy="285750"/>
+                  </a:xfrm>
+                  <a:prstGeom prst="rect">
+                    <a:avLst/>
+                  </a:prstGeom>
+                </pic:spPr>
+              </pic:pic>
+            </a:graphicData>
+          </a:graphic>
+        </wp:inline>
+      </w:drawing>
+    </w:r>
+    <w:r>
+      <w:rPr>
+        <w:rFonts w:ascii="Century Gothic" w:cs="Century Gothic" w:eastAsia="Century Gothic" w:hAnsi="Century Gothic"/>
+        <w:b/>
+        <w:bCs/>
+        <w:color w:val="16140E"/>
+        <w:spacing w:val="40"/>
+        <w:sz w:val="15"/>
+        <w:szCs w:val="15"/>
+      </w:rPr>
+      <w:t xml:space="preserve">  NAMED TO THE INC. 5000</w:t>
+    </w:r>
+  </w:p>
+  <w:p>
+    <w:pPr>
+      <w:spacing w:after="0" w:before="20"/>
+      <w:jc w:val="right"/>
+    </w:pPr>
+    <w:r>
+      <w:rPr>
+        <w:rFonts w:ascii="Century Gothic" w:cs="Century Gothic" w:eastAsia="Century Gothic" w:hAnsi="Century Gothic"/>
+        <w:color w:val="6F6A5D"/>
+        <w:spacing w:val="30"/>
+        <w:sz w:val="13"/>
+        <w:szCs w:val="13"/>
+      </w:rPr>
+      <w:t xml:space="preserve">AMERICA’S FASTEST-GROWING PRIVATE COMPANIES</w:t>
+    </w:r>
+  </w:p>
   <w:p>
     <w:pPr>
       <w:pBdr>
         <w:bottom w:val="single" w:color="C6FF3D" w:sz="10" w:space="2"/>
       </w:pBdr>
-      <w:spacing w:after="0" w:before="140"/>
+      <w:spacing w:after="0" w:before="90"/>
     </w:pPr>
   </w:p>
 </w:hdr>
@@ -531,8 +480,8 @@
       <w:rPr>
         <w:rFonts w:ascii="Century Gothic" w:cs="Century Gothic" w:eastAsia="Century Gothic" w:hAnsi="Century Gothic"/>
         <w:color w:val="16140E"/>
-        <w:sz w:val="22"/>
-        <w:szCs w:val="22"/>
+        <w:sz w:val="20"/>
+        <w:szCs w:val="20"/>
       </w:rPr>
     </w:rPrDefault>
     <w:pPrDefault/>
@@ -543,62 +492,61 @@
     <w:next w:val="Normal"/>
     <w:qFormat/>
     <w:pPr>
-      <w:spacing w:after="160"/>
-    </w:pPr>
-    <w:rPr>
-      <w:rFonts w:ascii="Bebas Neue" w:cs="Bebas Neue" w:eastAsia="Bebas Neue" w:hAnsi="Bebas Neue"/>
-      <w:color w:val="16140E"/>
-      <w:sz w:val="56"/>
-      <w:szCs w:val="56"/>
-    </w:rPr>
-  </w:style>
-  <w:style w:type="paragraph" w:styleId="Heading1">
-    <w:name w:val="Heading 1"/>
-    <w:basedOn w:val="Normal"/>
-    <w:next w:val="Normal"/>
-    <w:qFormat/>
-    <w:pPr>
-      <w:spacing w:after="120" w:before="320"/>
-    </w:pPr>
-    <w:rPr>
-      <w:rFonts w:ascii="Bebas Neue" w:cs="Bebas Neue" w:eastAsia="Bebas Neue" w:hAnsi="Bebas Neue"/>
-      <w:color w:val="16140E"/>
-      <w:sz w:val="40"/>
-      <w:szCs w:val="40"/>
-    </w:rPr>
-  </w:style>
-  <w:style w:type="paragraph" w:styleId="Heading2">
-    <w:name w:val="Heading 2"/>
-    <w:basedOn w:val="Normal"/>
-    <w:next w:val="Normal"/>
-    <w:qFormat/>
-    <w:pPr>
-      <w:spacing w:after="90" w:before="260"/>
+      <w:spacing w:after="140"/>
     </w:pPr>
     <w:rPr>
       <w:rFonts w:ascii="Century Gothic" w:cs="Century Gothic" w:eastAsia="Century Gothic" w:hAnsi="Century Gothic"/>
       <w:b/>
       <w:bCs/>
       <w:color w:val="16140E"/>
-      <w:sz w:val="24"/>
-      <w:szCs w:val="24"/>
-    </w:rPr>
-  </w:style>
-  <w:style w:type="paragraph" w:styleId="Heading3">
-    <w:name w:val="Heading 3"/>
-    <w:basedOn w:val="Normal"/>
-    <w:next w:val="Normal"/>
-    <w:qFormat/>
-    <w:pPr>
-      <w:spacing w:after="70" w:before="200"/>
+      <w:spacing w:val="-10"/>
+      <w:sz w:val="44"/>
+      <w:szCs w:val="44"/>
+    </w:rPr>
+  </w:style>
+  <w:style w:type="paragraph" w:styleId="Heading1">
+    <w:name w:val="Heading 1"/>
+    <w:basedOn w:val="Normal"/>
+    <w:next w:val="Normal"/>
+    <w:qFormat/>
+    <w:pPr>
+      <w:spacing w:after="110" w:before="300"/>
     </w:pPr>
     <w:rPr>
       <w:rFonts w:ascii="Century Gothic" w:cs="Century Gothic" w:eastAsia="Century Gothic" w:hAnsi="Century Gothic"/>
       <w:b/>
       <w:bCs/>
-      <w:color w:val="6F6A5D"/>
+      <w:color w:val="16140E"/>
+      <w:sz w:val="26"/>
+      <w:szCs w:val="26"/>
+    </w:rPr>
+  </w:style>
+  <w:style w:type="paragraph" w:styleId="Heading2">
+    <w:name w:val="Heading 2"/>
+    <w:basedOn w:val="Normal"/>
+    <w:next w:val="Normal"/>
+    <w:qFormat/>
+    <w:pPr>
+      <w:spacing w:after="70" w:before="220"/>
+    </w:pPr>
+    <w:rPr>
+      <w:rFonts w:ascii="Century Gothic" w:cs="Century Gothic" w:eastAsia="Century Gothic" w:hAnsi="Century Gothic"/>
+      <w:b/>
+      <w:bCs/>
+      <w:color w:val="16140E"/>
       <w:sz w:val="21"/>
       <w:szCs w:val="21"/>
+    </w:rPr>
+  </w:style>
+  <w:style w:type="paragraph" w:styleId="Heading3">
+    <w:name w:val="Heading 3"/>
+    <w:basedOn w:val="Normal"/>
+    <w:next w:val="Normal"/>
+    <w:qFormat/>
+    <w:rPr>
+      <w:color w:val="1F4D78"/>
+      <w:sz w:val="24"/>
+      <w:szCs w:val="24"/>
     </w:rPr>
   </w:style>
   <w:style w:type="paragraph" w:styleId="Heading4">
@@ -734,7 +682,7 @@
     <w:basedOn w:val="Normal"/>
     <w:next w:val="Normal"/>
     <w:pPr>
-      <w:spacing w:after="60"/>
+      <w:spacing w:after="70"/>
     </w:pPr>
     <w:rPr>
       <w:rFonts w:ascii="Century Gothic" w:cs="Century Gothic" w:eastAsia="Century Gothic" w:hAnsi="Century Gothic"/>
@@ -742,8 +690,8 @@
       <w:bCs/>
       <w:color w:val="8A6B00"/>
       <w:spacing w:val="60"/>
-      <w:sz w:val="17"/>
-      <w:szCs w:val="17"/>
+      <w:sz w:val="16"/>
+      <w:szCs w:val="16"/>
     </w:rPr>
   </w:style>
   <w:style w:type="paragraph" w:styleId="Lede">
@@ -751,33 +699,41 @@
     <w:basedOn w:val="Normal"/>
     <w:next w:val="Normal"/>
     <w:pPr>
-      <w:spacing w:after="220" w:line="330"/>
+      <w:spacing w:after="180" w:line="300"/>
     </w:pPr>
     <w:rPr>
       <w:rFonts w:ascii="Century Gothic" w:cs="Century Gothic" w:eastAsia="Century Gothic" w:hAnsi="Century Gothic"/>
       <w:color w:val="6F6A5D"/>
-      <w:sz w:val="24"/>
-      <w:szCs w:val="24"/>
-    </w:rPr>
-  </w:style>
-  <w:style w:type="paragraph" w:styleId="Pullquote">
-    <w:name w:val="Pullquote"/>
-    <w:basedOn w:val="Normal"/>
-    <w:next w:val="Normal"/>
-    <w:pPr>
-      <w:pBdr>
-        <w:left w:val="single" w:color="C6FF3D" w:sz="18" w:space="14"/>
-      </w:pBdr>
-      <w:spacing w:after="200" w:before="200"/>
-      <w:ind w:left="360"/>
+      <w:sz w:val="22"/>
+      <w:szCs w:val="22"/>
+    </w:rPr>
+  </w:style>
+  <w:style w:type="paragraph" w:styleId="Body">
+    <w:name w:val="Body"/>
+    <w:basedOn w:val="Normal"/>
+    <w:next w:val="Normal"/>
+    <w:pPr>
+      <w:spacing w:after="140" w:line="290"/>
     </w:pPr>
     <w:rPr>
       <w:rFonts w:ascii="Century Gothic" w:cs="Century Gothic" w:eastAsia="Century Gothic" w:hAnsi="Century Gothic"/>
-      <w:i/>
-      <w:iCs/>
       <w:color w:val="16140E"/>
-      <w:sz w:val="23"/>
-      <w:szCs w:val="23"/>
+      <w:sz w:val="20"/>
+      <w:szCs w:val="20"/>
+    </w:rPr>
+  </w:style>
+  <w:style w:type="paragraph" w:styleId="Fine">
+    <w:name w:val="Fine"/>
+    <w:basedOn w:val="Normal"/>
+    <w:next w:val="Normal"/>
+    <w:pPr>
+      <w:spacing w:after="80" w:line="260"/>
+    </w:pPr>
+    <w:rPr>
+      <w:rFonts w:ascii="Century Gothic" w:cs="Century Gothic" w:eastAsia="Century Gothic" w:hAnsi="Century Gothic"/>
+      <w:color w:val="6F6A5D"/>
+      <w:sz w:val="16"/>
+      <w:szCs w:val="16"/>
     </w:rPr>
   </w:style>
 </w:styles>

</xml_diff>

<commit_message>
Word templates: fixed table layout so Word stops re-measuring columns
</commit_message>
<xml_diff>
--- a/brand/bolt-creative-letterhead.docx
+++ b/brand/bolt-creative-letterhead.docx
@@ -258,7 +258,7 @@
     <w:r>
       <w:drawing>
         <wp:inline distT="0" distB="0" distL="0" distR="0">
-          <wp:extent cx="314325" cy="342900"/>
+          <wp:extent cx="400050" cy="438150"/>
           <wp:effectExtent t="0" r="0" b="0" l="0"/>
           <wp:docPr id="1" name="" descr="" title=""/>
           <wp:cNvGraphicFramePr>
@@ -283,7 +283,7 @@
                 <pic:spPr bwMode="auto">
                   <a:xfrm>
                     <a:off x="0" y="0"/>
-                    <a:ext cx="314325" cy="342900"/>
+                    <a:ext cx="400050" cy="438150"/>
                   </a:xfrm>
                   <a:prstGeom prst="rect">
                     <a:avLst/>

</xml_diff>